<commit_message>
Use compensation filter terminology across portfolio and documents
</commit_message>
<xml_diff>
--- a/content/taebin-yoo-cv.docx
+++ b/content/taebin-yoo-cv.docx
@@ -584,7 +584,7 @@
             <w:u w:val="single"/>
             <w:b/>
           </w:rPr>
-          <w:t>Corrective IR for Live Venues</w:t>
+          <w:t>Compensation Filter for Live Venues</w:t>
         </w:r>
       </w:hyperlink>
       <w:r>
@@ -999,7 +999,7 @@
             <w:u w:val="single"/>
             <w:b/>
           </w:rPr>
-          <w:t>Generation of Corrective Impulse Responses and a Real-Time Convolution System for Spatial Reproduction</w:t>
+          <w:t>Generation of Compensation Filters and a Real-Time Convolution System for Spatial Reproduction</w:t>
         </w:r>
       </w:hyperlink>
       <w:r>
@@ -1093,7 +1093,7 @@
           <w:b/>
           <w:sz w:val="18"/>
         </w:rPr>
-        <w:t>Corrective IR project paper</w:t>
+        <w:t>Compensation Filter project paper</w:t>
       </w:r>
       <w:r>
         <w:rPr>

</xml_diff>